<commit_message>
docs: add repository link
</commit_message>
<xml_diff>
--- a/docs/lab1-respuestas.docx
+++ b/docs/lab1-respuestas.docx
@@ -30,6 +30,26 @@
     </w:p>
     <w:p>
       <w:r>
+        <w:t>Enlace al repositorio:</w:t>
+      </w:r>
+    </w:p>
+    <w:p>
+      <w:pPr>
+        <w:rPr>
+          <w:i/>
+          <w:iCs/>
+        </w:rPr>
+      </w:pPr>
+      <w:r>
+        <w:rPr>
+          <w:i/>
+          <w:iCs/>
+        </w:rPr>
+        <w:t>https://github.com/Liria18/oracle-database-lab</w:t>
+      </w:r>
+    </w:p>
+    <w:p>
+      <w:r>
         <w:t>Profesor: Dr. Richard Avilés López</w:t>
       </w:r>
     </w:p>
@@ -125,13 +145,18 @@
       </w:r>
       <w:proofErr w:type="spellEnd"/>
       <w:r>
-        <w:t xml:space="preserve"> almacenado dentro de la carpeta .</w:t>
-      </w:r>
-      <w:proofErr w:type="spellStart"/>
-      <w:r>
-        <w:t>git</w:t>
-      </w:r>
-      <w:proofErr w:type="spellEnd"/>
+        <w:t xml:space="preserve"> almacenado dentro de la </w:t>
+      </w:r>
+      <w:proofErr w:type="gramStart"/>
+      <w:r>
+        <w:t>carpeta .</w:t>
+      </w:r>
+      <w:proofErr w:type="spellStart"/>
+      <w:r>
+        <w:t>git</w:t>
+      </w:r>
+      <w:proofErr w:type="spellEnd"/>
+      <w:proofErr w:type="gramEnd"/>
       <w:r>
         <w:t>.</w:t>
       </w:r>
@@ -284,7 +309,15 @@
       </w:r>
       <w:proofErr w:type="spellEnd"/>
       <w:r>
-        <w:t xml:space="preserve"> status y </w:t>
+        <w:t xml:space="preserve"> </w:t>
+      </w:r>
+      <w:proofErr w:type="gramStart"/>
+      <w:r>
+        <w:t>status</w:t>
+      </w:r>
+      <w:proofErr w:type="gramEnd"/>
+      <w:r>
+        <w:t xml:space="preserve"> y </w:t>
       </w:r>
       <w:proofErr w:type="spellStart"/>
       <w:r>
@@ -328,11 +361,8 @@
     <w:p/>
     <w:p>
       <w:r>
-        <w:t xml:space="preserve">Las carpetas vacías no aparecían porque Git no versiona carpetas directamente, sino archivos. Una carpeta vacía no contiene nada que Git pueda registrar. Para </w:t>
-      </w:r>
-      <w:r>
         <w:lastRenderedPageBreak/>
-        <w:t xml:space="preserve">conservar esas carpetas usamos archivos </w:t>
+        <w:t xml:space="preserve">Las carpetas vacías no aparecían porque Git no versiona carpetas directamente, sino archivos. Una carpeta vacía no contiene nada que Git pueda registrar. Para conservar esas carpetas usamos archivos </w:t>
       </w:r>
       <w:proofErr w:type="spellStart"/>
       <w:r>
@@ -340,15 +370,28 @@
       </w:r>
       <w:proofErr w:type="spellEnd"/>
       <w:r>
-        <w:t xml:space="preserve"> llamados .</w:t>
+        <w:t xml:space="preserve"> </w:t>
+      </w:r>
+      <w:proofErr w:type="gramStart"/>
+      <w:r>
+        <w:t>llamados .</w:t>
       </w:r>
       <w:proofErr w:type="spellStart"/>
       <w:r>
         <w:t>gitkeep</w:t>
       </w:r>
       <w:proofErr w:type="spellEnd"/>
-      <w:r>
-        <w:t xml:space="preserve">, por ejemplo </w:t>
+      <w:proofErr w:type="gramEnd"/>
+      <w:r>
+        <w:t xml:space="preserve">, por </w:t>
+      </w:r>
+      <w:proofErr w:type="gramStart"/>
+      <w:r>
+        <w:t>ejemplo</w:t>
+      </w:r>
+      <w:proofErr w:type="gramEnd"/>
+      <w:r>
+        <w:t xml:space="preserve"> </w:t>
       </w:r>
       <w:proofErr w:type="spellStart"/>
       <w:r>
@@ -363,6 +406,7 @@
         <w:t>schema</w:t>
       </w:r>
       <w:proofErr w:type="spellEnd"/>
+      <w:proofErr w:type="gramStart"/>
       <w:r>
         <w:t>/.</w:t>
       </w:r>
@@ -371,14 +415,20 @@
         <w:t>gitkeep</w:t>
       </w:r>
       <w:proofErr w:type="spellEnd"/>
-      <w:r>
-        <w:t xml:space="preserve"> y scripts/.</w:t>
+      <w:proofErr w:type="gramEnd"/>
+      <w:r>
+        <w:t xml:space="preserve"> y scripts</w:t>
+      </w:r>
+      <w:proofErr w:type="gramStart"/>
+      <w:r>
+        <w:t>/.</w:t>
       </w:r>
       <w:proofErr w:type="spellStart"/>
       <w:r>
         <w:t>gitkeep</w:t>
       </w:r>
       <w:proofErr w:type="spellEnd"/>
+      <w:proofErr w:type="gramEnd"/>
       <w:r>
         <w:t>.</w:t>
       </w:r>
@@ -597,35 +647,658 @@
     <w:p/>
     <w:p>
       <w:r>
+        <w:t xml:space="preserve"># Oracle </w:t>
+      </w:r>
+      <w:proofErr w:type="spellStart"/>
+      <w:r>
+        <w:t>Database</w:t>
+      </w:r>
+      <w:proofErr w:type="spellEnd"/>
+      <w:r>
+        <w:t xml:space="preserve"> Lab — </w:t>
+      </w:r>
+      <w:proofErr w:type="spellStart"/>
+      <w:r>
+        <w:t>Academic</w:t>
+      </w:r>
+      <w:proofErr w:type="spellEnd"/>
+      <w:r>
+        <w:t xml:space="preserve"> </w:t>
+      </w:r>
+      <w:proofErr w:type="spellStart"/>
+      <w:r>
+        <w:t>Version</w:t>
+      </w:r>
+      <w:proofErr w:type="spellEnd"/>
+    </w:p>
+    <w:p/>
+    <w:p>
+      <w:r>
+        <w:t xml:space="preserve">Los marcadores no forman parte del contenido final. Deben eliminarse y hay que elegir o combinar manualmente las dos versiones antes de ejecutar </w:t>
+      </w:r>
+      <w:proofErr w:type="spellStart"/>
+      <w:r>
+        <w:t>git</w:t>
+      </w:r>
+      <w:proofErr w:type="spellEnd"/>
+      <w:r>
+        <w:t xml:space="preserve"> </w:t>
+      </w:r>
+      <w:proofErr w:type="spellStart"/>
+      <w:r>
+        <w:t>add</w:t>
+      </w:r>
+      <w:proofErr w:type="spellEnd"/>
+      <w:r>
+        <w:t xml:space="preserve"> y </w:t>
+      </w:r>
+      <w:proofErr w:type="spellStart"/>
+      <w:r>
+        <w:t>git</w:t>
+      </w:r>
+      <w:proofErr w:type="spellEnd"/>
+      <w:r>
+        <w:t xml:space="preserve"> </w:t>
+      </w:r>
+      <w:proofErr w:type="spellStart"/>
+      <w:r>
+        <w:t>commit</w:t>
+      </w:r>
+      <w:proofErr w:type="spellEnd"/>
+      <w:r>
+        <w:t>.</w:t>
+      </w:r>
+    </w:p>
+    <w:p/>
+    <w:p>
+      <w:r>
+        <w:t xml:space="preserve">7. Por qué no usar </w:t>
+      </w:r>
+      <w:proofErr w:type="spellStart"/>
+      <w:r>
+        <w:t>git</w:t>
+      </w:r>
+      <w:proofErr w:type="spellEnd"/>
+      <w:r>
+        <w:t xml:space="preserve"> </w:t>
+      </w:r>
+      <w:proofErr w:type="spellStart"/>
+      <w:r>
+        <w:t>commit</w:t>
+      </w:r>
+      <w:proofErr w:type="spellEnd"/>
+      <w:r>
+        <w:t xml:space="preserve"> --</w:t>
+      </w:r>
+      <w:proofErr w:type="spellStart"/>
+      <w:r>
+        <w:t>amend</w:t>
+      </w:r>
+      <w:proofErr w:type="spellEnd"/>
+      <w:r>
+        <w:t xml:space="preserve"> después de hacer </w:t>
+      </w:r>
+      <w:proofErr w:type="spellStart"/>
+      <w:r>
+        <w:t>push</w:t>
+      </w:r>
+      <w:proofErr w:type="spellEnd"/>
+    </w:p>
+    <w:p/>
+    <w:p>
+      <w:proofErr w:type="spellStart"/>
+      <w:r>
+        <w:t>git</w:t>
+      </w:r>
+      <w:proofErr w:type="spellEnd"/>
+      <w:r>
+        <w:t xml:space="preserve"> </w:t>
+      </w:r>
+      <w:proofErr w:type="spellStart"/>
+      <w:r>
+        <w:t>commit</w:t>
+      </w:r>
+      <w:proofErr w:type="spellEnd"/>
+      <w:r>
+        <w:t xml:space="preserve"> --</w:t>
+      </w:r>
+      <w:proofErr w:type="spellStart"/>
+      <w:r>
+        <w:t>amend</w:t>
+      </w:r>
+      <w:proofErr w:type="spellEnd"/>
+      <w:r>
+        <w:t xml:space="preserve"> reemplaza el último </w:t>
+      </w:r>
+      <w:proofErr w:type="spellStart"/>
+      <w:r>
+        <w:t>commit</w:t>
+      </w:r>
+      <w:proofErr w:type="spellEnd"/>
+      <w:r>
+        <w:t xml:space="preserve"> y crea otro con un hash diferente. Si el </w:t>
+      </w:r>
+      <w:proofErr w:type="spellStart"/>
+      <w:r>
+        <w:t>commit</w:t>
+      </w:r>
+      <w:proofErr w:type="spellEnd"/>
+      <w:r>
+        <w:t xml:space="preserve"> ya se ha subido a GitHub, otras personas pueden haberlo descargado. Reescribirlo provocaría que los historiales local y remoto fueran diferentes y podría causar problemas de sincronización. En ese caso es más seguro crear un </w:t>
+      </w:r>
+      <w:proofErr w:type="spellStart"/>
+      <w:r>
+        <w:t>commit</w:t>
+      </w:r>
+      <w:proofErr w:type="spellEnd"/>
+      <w:r>
+        <w:t xml:space="preserve"> nuevo.</w:t>
+      </w:r>
+    </w:p>
+    <w:p/>
+    <w:p>
+      <w:r>
+        <w:t>Durante este laboratorio usamos --</w:t>
+      </w:r>
+      <w:proofErr w:type="spellStart"/>
+      <w:r>
+        <w:t>amend</w:t>
+      </w:r>
+      <w:proofErr w:type="spellEnd"/>
+      <w:r>
+        <w:t xml:space="preserve"> antes de hacer </w:t>
+      </w:r>
+      <w:proofErr w:type="spellStart"/>
+      <w:r>
+        <w:t>push</w:t>
+      </w:r>
+      <w:proofErr w:type="spellEnd"/>
+      <w:r>
+        <w:t>, por lo que el cambio solo afectó al historial local.</w:t>
+      </w:r>
+    </w:p>
+    <w:p/>
+    <w:p>
+      <w:r>
+        <w:t xml:space="preserve">8. Qué ocurre si se borra la </w:t>
+      </w:r>
+      <w:proofErr w:type="gramStart"/>
+      <w:r>
+        <w:t>carpeta .</w:t>
+      </w:r>
+      <w:proofErr w:type="spellStart"/>
+      <w:r>
+        <w:t>git</w:t>
+      </w:r>
+      <w:proofErr w:type="spellEnd"/>
+      <w:proofErr w:type="gramEnd"/>
+    </w:p>
+    <w:p/>
+    <w:p>
+      <w:r>
+        <w:t xml:space="preserve">Se pierde el historial local, los </w:t>
+      </w:r>
+      <w:proofErr w:type="spellStart"/>
+      <w:r>
+        <w:t>commits</w:t>
+      </w:r>
+      <w:proofErr w:type="spellEnd"/>
+      <w:r>
+        <w:t xml:space="preserve">, las ramas, las referencias, la configuración del repositorio y la relación local con el remoto. Sin embargo, los archivos del proyecto que están fuera </w:t>
+      </w:r>
+      <w:proofErr w:type="gramStart"/>
+      <w:r>
+        <w:t>de .</w:t>
+      </w:r>
+      <w:proofErr w:type="spellStart"/>
+      <w:r>
+        <w:t>git</w:t>
+      </w:r>
+      <w:proofErr w:type="spellEnd"/>
+      <w:proofErr w:type="gramEnd"/>
+      <w:r>
+        <w:t xml:space="preserve"> no se borran. El código y la documentación seguirían en el disco, pero ya no estarían controlados por ese repositorio Git.</w:t>
+      </w:r>
+    </w:p>
+    <w:p/>
+    <w:p>
+      <w:r>
+        <w:t>9. Diferencia entre Git y GitHub</w:t>
+      </w:r>
+    </w:p>
+    <w:p/>
+    <w:p>
+      <w:r>
+        <w:t xml:space="preserve">Git es el programa de control de versiones que se ejecuta en el ordenador. Permite crear </w:t>
+      </w:r>
+      <w:proofErr w:type="spellStart"/>
+      <w:r>
+        <w:t>commits</w:t>
+      </w:r>
+      <w:proofErr w:type="spellEnd"/>
+      <w:r>
+        <w:t xml:space="preserve">, ramas, </w:t>
+      </w:r>
+      <w:proofErr w:type="spellStart"/>
+      <w:r>
+        <w:t>merges</w:t>
+      </w:r>
+      <w:proofErr w:type="spellEnd"/>
+      <w:r>
+        <w:t xml:space="preserve"> y consultar el historial incluso sin conexión a Internet. GitHub es un servicio web que aloja repositorios Git y proporciona funciones de colaboración como Pull </w:t>
+      </w:r>
+      <w:proofErr w:type="spellStart"/>
+      <w:r>
+        <w:t>Requests</w:t>
+      </w:r>
+      <w:proofErr w:type="spellEnd"/>
+      <w:r>
+        <w:t>, revisión de código, Issues y protección de ramas.</w:t>
+      </w:r>
+    </w:p>
+    <w:p/>
+    <w:p>
+      <w:r>
+        <w:t xml:space="preserve">10. Por qué no se debe subir un </w:t>
+      </w:r>
+      <w:proofErr w:type="gramStart"/>
+      <w:r>
+        <w:t>archivo .</w:t>
+      </w:r>
+      <w:proofErr w:type="spellStart"/>
+      <w:r>
+        <w:t>env</w:t>
+      </w:r>
+      <w:proofErr w:type="spellEnd"/>
+      <w:proofErr w:type="gramEnd"/>
+      <w:r>
+        <w:t xml:space="preserve"> con contraseñas reales</w:t>
+      </w:r>
+    </w:p>
+    <w:p/>
+    <w:p>
+      <w:r>
+        <w:t xml:space="preserve">Un </w:t>
+      </w:r>
+      <w:proofErr w:type="gramStart"/>
+      <w:r>
+        <w:t>archivo .</w:t>
+      </w:r>
+      <w:proofErr w:type="spellStart"/>
+      <w:r>
+        <w:t>env</w:t>
+      </w:r>
+      <w:proofErr w:type="spellEnd"/>
+      <w:proofErr w:type="gramEnd"/>
+      <w:r>
+        <w:t xml:space="preserve"> puede contener contraseñas, tokens, claves privadas o datos de conexión. Subirlo a un repositorio puede exponer esas credenciales, incluso si el repositorio es privado. Además, aunque se borre después, el secreto puede permanecer en el historial de Git. La práctica correcta es </w:t>
+      </w:r>
+      <w:proofErr w:type="gramStart"/>
+      <w:r>
+        <w:t>incluir .</w:t>
+      </w:r>
+      <w:proofErr w:type="spellStart"/>
+      <w:r>
+        <w:t>env</w:t>
+      </w:r>
+      <w:proofErr w:type="spellEnd"/>
+      <w:proofErr w:type="gramEnd"/>
+      <w:r>
+        <w:t xml:space="preserve"> </w:t>
+      </w:r>
+      <w:proofErr w:type="gramStart"/>
+      <w:r>
+        <w:t>en .</w:t>
+      </w:r>
+      <w:proofErr w:type="spellStart"/>
+      <w:r>
+        <w:t>gitignore</w:t>
+      </w:r>
+      <w:proofErr w:type="spellEnd"/>
+      <w:proofErr w:type="gramEnd"/>
+      <w:r>
+        <w:t xml:space="preserve"> y crear un </w:t>
+      </w:r>
+      <w:proofErr w:type="gramStart"/>
+      <w:r>
+        <w:t>archivo .</w:t>
+      </w:r>
+      <w:proofErr w:type="spellStart"/>
+      <w:r>
+        <w:t>env</w:t>
+      </w:r>
+      <w:proofErr w:type="gramEnd"/>
+      <w:r>
+        <w:t>.example</w:t>
+      </w:r>
+      <w:proofErr w:type="spellEnd"/>
+      <w:r>
+        <w:t xml:space="preserve"> sin valores secretos.</w:t>
+      </w:r>
+    </w:p>
+    <w:p/>
+    <w:p>
+      <w:r>
+        <w:t>11. Error non-</w:t>
+      </w:r>
+      <w:proofErr w:type="spellStart"/>
+      <w:r>
+        <w:t>fast</w:t>
+      </w:r>
+      <w:proofErr w:type="spellEnd"/>
+      <w:r>
+        <w:t>-forward</w:t>
+      </w:r>
+    </w:p>
+    <w:p/>
+    <w:p>
+      <w:r>
+        <w:t>El error non-</w:t>
+      </w:r>
+      <w:proofErr w:type="spellStart"/>
+      <w:r>
+        <w:t>fast</w:t>
+      </w:r>
+      <w:proofErr w:type="spellEnd"/>
+      <w:r>
+        <w:t xml:space="preserve">-forward normalmente significa que el repositorio remoto contiene </w:t>
+      </w:r>
+      <w:proofErr w:type="spellStart"/>
+      <w:r>
+        <w:t>commits</w:t>
+      </w:r>
+      <w:proofErr w:type="spellEnd"/>
+      <w:r>
+        <w:t xml:space="preserve"> que todavía no tengo en mi copia local. Puede ocurrir si alguien hizo cambios desde GitHub o si trabajé desde otro ordenador. El primer comando que ejecutaría es:</w:t>
+      </w:r>
+    </w:p>
+    <w:p/>
+    <w:p>
+      <w:proofErr w:type="spellStart"/>
+      <w:r>
+        <w:t>git</w:t>
+      </w:r>
+      <w:proofErr w:type="spellEnd"/>
+      <w:r>
+        <w:t xml:space="preserve"> </w:t>
+      </w:r>
+      <w:proofErr w:type="spellStart"/>
+      <w:r>
+        <w:t>pull</w:t>
+      </w:r>
+      <w:proofErr w:type="spellEnd"/>
+    </w:p>
+    <w:p/>
+    <w:p>
+      <w:r>
+        <w:t xml:space="preserve">Después revisaría los cambios, resolvería cualquier conflicto, crearía el </w:t>
+      </w:r>
+      <w:proofErr w:type="spellStart"/>
+      <w:r>
+        <w:t>commit</w:t>
+      </w:r>
+      <w:proofErr w:type="spellEnd"/>
+      <w:r>
+        <w:t xml:space="preserve"> correspondiente si fuera necesario y ejecutaría </w:t>
+      </w:r>
+      <w:proofErr w:type="spellStart"/>
+      <w:r>
+        <w:t>git</w:t>
+      </w:r>
+      <w:proofErr w:type="spellEnd"/>
+      <w:r>
+        <w:t xml:space="preserve"> </w:t>
+      </w:r>
+      <w:proofErr w:type="spellStart"/>
+      <w:r>
+        <w:t>push</w:t>
+      </w:r>
+      <w:proofErr w:type="spellEnd"/>
+      <w:r>
+        <w:t>.</w:t>
+      </w:r>
+    </w:p>
+    <w:p/>
+    <w:p>
+      <w:r>
+        <w:t xml:space="preserve">12. Tipos de </w:t>
+      </w:r>
+      <w:proofErr w:type="spellStart"/>
+      <w:r>
+        <w:t>Conventional</w:t>
+      </w:r>
+      <w:proofErr w:type="spellEnd"/>
+      <w:r>
+        <w:t xml:space="preserve"> </w:t>
+      </w:r>
+      <w:proofErr w:type="spellStart"/>
+      <w:r>
+        <w:t>Commits</w:t>
+      </w:r>
+      <w:proofErr w:type="spellEnd"/>
+    </w:p>
+    <w:p/>
+    <w:p>
+      <w:r>
+        <w:t xml:space="preserve">Para añadir un índice de rendimiento a una tabla utilizaría </w:t>
+      </w:r>
+      <w:proofErr w:type="spellStart"/>
+      <w:r>
+        <w:t>perf</w:t>
+      </w:r>
+      <w:proofErr w:type="spellEnd"/>
+      <w:r>
+        <w:t>, porque es una mejora de rendimiento:</w:t>
+      </w:r>
+    </w:p>
+    <w:p/>
+    <w:p>
+      <w:proofErr w:type="spellStart"/>
+      <w:r>
+        <w:t>perf</w:t>
+      </w:r>
+      <w:proofErr w:type="spellEnd"/>
+      <w:r>
+        <w:t>(</w:t>
+      </w:r>
+      <w:proofErr w:type="spellStart"/>
+      <w:r>
+        <w:t>db</w:t>
+      </w:r>
+      <w:proofErr w:type="spellEnd"/>
+      <w:r>
+        <w:t xml:space="preserve">): </w:t>
+      </w:r>
+      <w:proofErr w:type="spellStart"/>
+      <w:r>
+        <w:t>add</w:t>
+      </w:r>
+      <w:proofErr w:type="spellEnd"/>
+      <w:r>
+        <w:t xml:space="preserve"> </w:t>
+      </w:r>
+      <w:proofErr w:type="spellStart"/>
+      <w:r>
+        <w:t>customer</w:t>
+      </w:r>
+      <w:proofErr w:type="spellEnd"/>
+      <w:r>
+        <w:t xml:space="preserve"> </w:t>
+      </w:r>
+      <w:proofErr w:type="spellStart"/>
+      <w:r>
+        <w:t>lookup</w:t>
+      </w:r>
+      <w:proofErr w:type="spellEnd"/>
+      <w:r>
+        <w:t xml:space="preserve"> </w:t>
+      </w:r>
+      <w:proofErr w:type="spellStart"/>
+      <w:r>
+        <w:t>index</w:t>
+      </w:r>
+      <w:proofErr w:type="spellEnd"/>
+    </w:p>
+    <w:p/>
+    <w:p>
+      <w:r>
+        <w:t xml:space="preserve">Para corregir una restricción mal definida utilizaría </w:t>
+      </w:r>
+      <w:proofErr w:type="spellStart"/>
+      <w:r>
+        <w:t>fix</w:t>
+      </w:r>
+      <w:proofErr w:type="spellEnd"/>
+      <w:r>
+        <w:t>, porque estoy corrigiendo un error:</w:t>
+      </w:r>
+    </w:p>
+    <w:p/>
+    <w:p>
+      <w:proofErr w:type="spellStart"/>
+      <w:r>
         <w:lastRenderedPageBreak/>
-        <w:t xml:space="preserve"># Oracle </w:t>
-      </w:r>
-      <w:proofErr w:type="spellStart"/>
-      <w:r>
-        <w:t>Database</w:t>
-      </w:r>
-      <w:proofErr w:type="spellEnd"/>
-      <w:r>
-        <w:t xml:space="preserve"> Lab — </w:t>
-      </w:r>
-      <w:proofErr w:type="spellStart"/>
-      <w:r>
-        <w:t>Academic</w:t>
-      </w:r>
-      <w:proofErr w:type="spellEnd"/>
-      <w:r>
-        <w:t xml:space="preserve"> </w:t>
-      </w:r>
-      <w:proofErr w:type="spellStart"/>
-      <w:r>
-        <w:t>Version</w:t>
-      </w:r>
-      <w:proofErr w:type="spellEnd"/>
-    </w:p>
-    <w:p/>
-    <w:p>
-      <w:r>
-        <w:t xml:space="preserve">Los marcadores no forman parte del contenido final. Deben eliminarse y hay que elegir o combinar manualmente las dos versiones antes de ejecutar </w:t>
+        <w:t>fix</w:t>
+      </w:r>
+      <w:proofErr w:type="spellEnd"/>
+      <w:r>
+        <w:t>(</w:t>
+      </w:r>
+      <w:proofErr w:type="spellStart"/>
+      <w:r>
+        <w:t>db</w:t>
+      </w:r>
+      <w:proofErr w:type="spellEnd"/>
+      <w:r>
+        <w:t xml:space="preserve">): </w:t>
+      </w:r>
+      <w:proofErr w:type="spellStart"/>
+      <w:r>
+        <w:t>correct</w:t>
+      </w:r>
+      <w:proofErr w:type="spellEnd"/>
+      <w:r>
+        <w:t xml:space="preserve"> </w:t>
+      </w:r>
+      <w:proofErr w:type="spellStart"/>
+      <w:r>
+        <w:t>invalid</w:t>
+      </w:r>
+      <w:proofErr w:type="spellEnd"/>
+      <w:r>
+        <w:t xml:space="preserve"> table </w:t>
+      </w:r>
+      <w:proofErr w:type="spellStart"/>
+      <w:r>
+        <w:t>constraint</w:t>
+      </w:r>
+      <w:proofErr w:type="spellEnd"/>
+    </w:p>
+    <w:p/>
+    <w:p>
+      <w:r>
+        <w:t xml:space="preserve">Para actualizar el README utilizaría </w:t>
+      </w:r>
+      <w:proofErr w:type="spellStart"/>
+      <w:r>
+        <w:t>docs</w:t>
+      </w:r>
+      <w:proofErr w:type="spellEnd"/>
+      <w:r>
+        <w:t>, porque el cambio afecta únicamente a la documentación:</w:t>
+      </w:r>
+    </w:p>
+    <w:p/>
+    <w:p>
+      <w:proofErr w:type="spellStart"/>
+      <w:r>
+        <w:t>docs</w:t>
+      </w:r>
+      <w:proofErr w:type="spellEnd"/>
+      <w:r>
+        <w:t xml:space="preserve">: </w:t>
+      </w:r>
+      <w:proofErr w:type="spellStart"/>
+      <w:r>
+        <w:t>update</w:t>
+      </w:r>
+      <w:proofErr w:type="spellEnd"/>
+      <w:r>
+        <w:t xml:space="preserve"> README</w:t>
+      </w:r>
+    </w:p>
+    <w:p/>
+    <w:p>
+      <w:r>
+        <w:t>LECCIONES APRENDIDAS</w:t>
+      </w:r>
+    </w:p>
+    <w:p/>
+    <w:p>
+      <w:r>
+        <w:t>1. Flujo de trabajo de Git</w:t>
+      </w:r>
+    </w:p>
+    <w:p/>
+    <w:p>
+      <w:r>
+        <w:t xml:space="preserve">He aprendido que un cambio pasa por varias zonas: Working </w:t>
+      </w:r>
+      <w:proofErr w:type="spellStart"/>
+      <w:r>
+        <w:t>Directory</w:t>
+      </w:r>
+      <w:proofErr w:type="spellEnd"/>
+      <w:r>
+        <w:t xml:space="preserve">, </w:t>
+      </w:r>
+      <w:proofErr w:type="spellStart"/>
+      <w:r>
+        <w:t>Staging</w:t>
+      </w:r>
+      <w:proofErr w:type="spellEnd"/>
+      <w:r>
+        <w:t xml:space="preserve"> </w:t>
+      </w:r>
+      <w:proofErr w:type="spellStart"/>
+      <w:r>
+        <w:t>Area</w:t>
+      </w:r>
+      <w:proofErr w:type="spellEnd"/>
+      <w:r>
+        <w:t xml:space="preserve">, Local </w:t>
+      </w:r>
+      <w:proofErr w:type="spellStart"/>
+      <w:r>
+        <w:t>Repository</w:t>
+      </w:r>
+      <w:proofErr w:type="spellEnd"/>
+      <w:r>
+        <w:t xml:space="preserve"> y Remote </w:t>
+      </w:r>
+      <w:proofErr w:type="spellStart"/>
+      <w:r>
+        <w:t>Repository</w:t>
+      </w:r>
+      <w:proofErr w:type="spellEnd"/>
+      <w:r>
+        <w:t xml:space="preserve">. El flujo habitual es editar un archivo, revisar </w:t>
+      </w:r>
+      <w:proofErr w:type="spellStart"/>
+      <w:r>
+        <w:t>git</w:t>
+      </w:r>
+      <w:proofErr w:type="spellEnd"/>
+      <w:r>
+        <w:t xml:space="preserve"> </w:t>
+      </w:r>
+      <w:proofErr w:type="gramStart"/>
+      <w:r>
+        <w:t>status</w:t>
+      </w:r>
+      <w:proofErr w:type="gramEnd"/>
+      <w:r>
+        <w:t xml:space="preserve">, añadirlo con </w:t>
       </w:r>
       <w:proofErr w:type="spellStart"/>
       <w:r>
@@ -641,15 +1314,31 @@
       </w:r>
       <w:proofErr w:type="spellEnd"/>
       <w:r>
-        <w:t xml:space="preserve"> y </w:t>
-      </w:r>
-      <w:proofErr w:type="spellStart"/>
-      <w:r>
-        <w:t>git</w:t>
-      </w:r>
-      <w:proofErr w:type="spellEnd"/>
-      <w:r>
-        <w:t xml:space="preserve"> </w:t>
+        <w:t xml:space="preserve">, revisar </w:t>
+      </w:r>
+      <w:proofErr w:type="spellStart"/>
+      <w:r>
+        <w:t>git</w:t>
+      </w:r>
+      <w:proofErr w:type="spellEnd"/>
+      <w:r>
+        <w:t xml:space="preserve"> </w:t>
+      </w:r>
+      <w:proofErr w:type="spellStart"/>
+      <w:r>
+        <w:t>diff</w:t>
+      </w:r>
+      <w:proofErr w:type="spellEnd"/>
+      <w:r>
+        <w:t xml:space="preserve"> --</w:t>
+      </w:r>
+      <w:proofErr w:type="spellStart"/>
+      <w:r>
+        <w:t>staged</w:t>
+      </w:r>
+      <w:proofErr w:type="spellEnd"/>
+      <w:r>
+        <w:t xml:space="preserve">, crear un </w:t>
       </w:r>
       <w:proofErr w:type="spellStart"/>
       <w:r>
@@ -657,622 +1346,28 @@
       </w:r>
       <w:proofErr w:type="spellEnd"/>
       <w:r>
+        <w:t xml:space="preserve"> y finalmente hacer </w:t>
+      </w:r>
+      <w:proofErr w:type="spellStart"/>
+      <w:r>
+        <w:t>git</w:t>
+      </w:r>
+      <w:proofErr w:type="spellEnd"/>
+      <w:r>
+        <w:t xml:space="preserve"> </w:t>
+      </w:r>
+      <w:proofErr w:type="spellStart"/>
+      <w:r>
+        <w:t>push</w:t>
+      </w:r>
+      <w:proofErr w:type="spellEnd"/>
+      <w:r>
         <w:t>.</w:t>
       </w:r>
     </w:p>
     <w:p/>
     <w:p>
       <w:r>
-        <w:t xml:space="preserve">7. Por qué no usar </w:t>
-      </w:r>
-      <w:proofErr w:type="spellStart"/>
-      <w:r>
-        <w:t>git</w:t>
-      </w:r>
-      <w:proofErr w:type="spellEnd"/>
-      <w:r>
-        <w:t xml:space="preserve"> </w:t>
-      </w:r>
-      <w:proofErr w:type="spellStart"/>
-      <w:r>
-        <w:t>commit</w:t>
-      </w:r>
-      <w:proofErr w:type="spellEnd"/>
-      <w:r>
-        <w:t xml:space="preserve"> --</w:t>
-      </w:r>
-      <w:proofErr w:type="spellStart"/>
-      <w:r>
-        <w:t>amend</w:t>
-      </w:r>
-      <w:proofErr w:type="spellEnd"/>
-      <w:r>
-        <w:t xml:space="preserve"> después de hacer </w:t>
-      </w:r>
-      <w:proofErr w:type="spellStart"/>
-      <w:r>
-        <w:t>push</w:t>
-      </w:r>
-      <w:proofErr w:type="spellEnd"/>
-    </w:p>
-    <w:p/>
-    <w:p>
-      <w:proofErr w:type="spellStart"/>
-      <w:r>
-        <w:t>git</w:t>
-      </w:r>
-      <w:proofErr w:type="spellEnd"/>
-      <w:r>
-        <w:t xml:space="preserve"> </w:t>
-      </w:r>
-      <w:proofErr w:type="spellStart"/>
-      <w:r>
-        <w:t>commit</w:t>
-      </w:r>
-      <w:proofErr w:type="spellEnd"/>
-      <w:r>
-        <w:t xml:space="preserve"> --</w:t>
-      </w:r>
-      <w:proofErr w:type="spellStart"/>
-      <w:r>
-        <w:t>amend</w:t>
-      </w:r>
-      <w:proofErr w:type="spellEnd"/>
-      <w:r>
-        <w:t xml:space="preserve"> reemplaza el último </w:t>
-      </w:r>
-      <w:proofErr w:type="spellStart"/>
-      <w:r>
-        <w:t>commit</w:t>
-      </w:r>
-      <w:proofErr w:type="spellEnd"/>
-      <w:r>
-        <w:t xml:space="preserve"> y crea otro con un hash diferente. Si el </w:t>
-      </w:r>
-      <w:proofErr w:type="spellStart"/>
-      <w:r>
-        <w:t>commit</w:t>
-      </w:r>
-      <w:proofErr w:type="spellEnd"/>
-      <w:r>
-        <w:t xml:space="preserve"> ya se ha subido a GitHub, otras personas pueden haberlo descargado. Reescribirlo provocaría que los historiales local y remoto fueran diferentes y podría causar problemas de sincronización. En ese caso es más seguro crear un </w:t>
-      </w:r>
-      <w:proofErr w:type="spellStart"/>
-      <w:r>
-        <w:t>commit</w:t>
-      </w:r>
-      <w:proofErr w:type="spellEnd"/>
-      <w:r>
-        <w:t xml:space="preserve"> nuevo.</w:t>
-      </w:r>
-    </w:p>
-    <w:p/>
-    <w:p>
-      <w:r>
-        <w:t>Durante este laboratorio usamos --</w:t>
-      </w:r>
-      <w:proofErr w:type="spellStart"/>
-      <w:r>
-        <w:t>amend</w:t>
-      </w:r>
-      <w:proofErr w:type="spellEnd"/>
-      <w:r>
-        <w:t xml:space="preserve"> antes de hacer </w:t>
-      </w:r>
-      <w:proofErr w:type="spellStart"/>
-      <w:r>
-        <w:t>push</w:t>
-      </w:r>
-      <w:proofErr w:type="spellEnd"/>
-      <w:r>
-        <w:t>, por lo que el cambio solo afectó al historial local.</w:t>
-      </w:r>
-    </w:p>
-    <w:p/>
-    <w:p>
-      <w:r>
-        <w:t>8. Qué ocurre si se borra la carpeta .</w:t>
-      </w:r>
-      <w:proofErr w:type="spellStart"/>
-      <w:r>
-        <w:t>git</w:t>
-      </w:r>
-      <w:proofErr w:type="spellEnd"/>
-    </w:p>
-    <w:p/>
-    <w:p>
-      <w:r>
-        <w:t xml:space="preserve">Se pierde el historial local, los </w:t>
-      </w:r>
-      <w:proofErr w:type="spellStart"/>
-      <w:r>
-        <w:t>commits</w:t>
-      </w:r>
-      <w:proofErr w:type="spellEnd"/>
-      <w:r>
-        <w:t>, las ramas, las referencias, la configuración del repositorio y la relación local con el remoto. Sin embargo, los archivos del proyecto que están fuera de .</w:t>
-      </w:r>
-      <w:proofErr w:type="spellStart"/>
-      <w:r>
-        <w:t>git</w:t>
-      </w:r>
-      <w:proofErr w:type="spellEnd"/>
-      <w:r>
-        <w:t xml:space="preserve"> no se borran. El código y la documentación seguirían en el disco, pero ya no estarían controlados por ese repositorio Git.</w:t>
-      </w:r>
-    </w:p>
-    <w:p/>
-    <w:p>
-      <w:r>
-        <w:t>9. Diferencia entre Git y GitHub</w:t>
-      </w:r>
-    </w:p>
-    <w:p/>
-    <w:p>
-      <w:r>
-        <w:t xml:space="preserve">Git es el programa de control de versiones que se ejecuta en el ordenador. Permite crear </w:t>
-      </w:r>
-      <w:proofErr w:type="spellStart"/>
-      <w:r>
-        <w:t>commits</w:t>
-      </w:r>
-      <w:proofErr w:type="spellEnd"/>
-      <w:r>
-        <w:t xml:space="preserve">, ramas, </w:t>
-      </w:r>
-      <w:proofErr w:type="spellStart"/>
-      <w:r>
-        <w:t>merges</w:t>
-      </w:r>
-      <w:proofErr w:type="spellEnd"/>
-      <w:r>
-        <w:t xml:space="preserve"> y consultar el historial incluso sin conexión a Internet. GitHub es un servicio web que aloja repositorios Git y proporciona funciones de colaboración como Pull </w:t>
-      </w:r>
-      <w:proofErr w:type="spellStart"/>
-      <w:r>
-        <w:t>Requests</w:t>
-      </w:r>
-      <w:proofErr w:type="spellEnd"/>
-      <w:r>
-        <w:t>, revisión de código, Issues y protección de ramas.</w:t>
-      </w:r>
-    </w:p>
-    <w:p/>
-    <w:p>
-      <w:r>
-        <w:lastRenderedPageBreak/>
-        <w:t>10. Por qué no se debe subir un archivo .</w:t>
-      </w:r>
-      <w:proofErr w:type="spellStart"/>
-      <w:r>
-        <w:t>env</w:t>
-      </w:r>
-      <w:proofErr w:type="spellEnd"/>
-      <w:r>
-        <w:t xml:space="preserve"> con contraseñas reales</w:t>
-      </w:r>
-    </w:p>
-    <w:p/>
-    <w:p>
-      <w:r>
-        <w:t>Un archivo .</w:t>
-      </w:r>
-      <w:proofErr w:type="spellStart"/>
-      <w:r>
-        <w:t>env</w:t>
-      </w:r>
-      <w:proofErr w:type="spellEnd"/>
-      <w:r>
-        <w:t xml:space="preserve"> puede contener contraseñas, tokens, claves privadas o datos de conexión. Subirlo a un repositorio puede exponer esas credenciales, incluso si el repositorio es privado. Además, aunque se borre después, el secreto puede permanecer en el historial de Git. La práctica correcta es incluir .</w:t>
-      </w:r>
-      <w:proofErr w:type="spellStart"/>
-      <w:r>
-        <w:t>env</w:t>
-      </w:r>
-      <w:proofErr w:type="spellEnd"/>
-      <w:r>
-        <w:t xml:space="preserve"> en .</w:t>
-      </w:r>
-      <w:proofErr w:type="spellStart"/>
-      <w:r>
-        <w:t>gitignore</w:t>
-      </w:r>
-      <w:proofErr w:type="spellEnd"/>
-      <w:r>
-        <w:t xml:space="preserve"> y crear un archivo .</w:t>
-      </w:r>
-      <w:proofErr w:type="spellStart"/>
-      <w:r>
-        <w:t>env.example</w:t>
-      </w:r>
-      <w:proofErr w:type="spellEnd"/>
-      <w:r>
-        <w:t xml:space="preserve"> sin valores secretos.</w:t>
-      </w:r>
-    </w:p>
-    <w:p/>
-    <w:p>
-      <w:r>
-        <w:t>11. Error non-</w:t>
-      </w:r>
-      <w:proofErr w:type="spellStart"/>
-      <w:r>
-        <w:t>fast</w:t>
-      </w:r>
-      <w:proofErr w:type="spellEnd"/>
-      <w:r>
-        <w:t>-forward</w:t>
-      </w:r>
-    </w:p>
-    <w:p/>
-    <w:p>
-      <w:r>
-        <w:t>El error non-</w:t>
-      </w:r>
-      <w:proofErr w:type="spellStart"/>
-      <w:r>
-        <w:t>fast</w:t>
-      </w:r>
-      <w:proofErr w:type="spellEnd"/>
-      <w:r>
-        <w:t xml:space="preserve">-forward normalmente significa que el repositorio remoto contiene </w:t>
-      </w:r>
-      <w:proofErr w:type="spellStart"/>
-      <w:r>
-        <w:t>commits</w:t>
-      </w:r>
-      <w:proofErr w:type="spellEnd"/>
-      <w:r>
-        <w:t xml:space="preserve"> que todavía no tengo en mi copia local. Puede ocurrir si alguien hizo cambios desde GitHub o si trabajé desde otro ordenador. El primer comando que ejecutaría es:</w:t>
-      </w:r>
-    </w:p>
-    <w:p/>
-    <w:p>
-      <w:proofErr w:type="spellStart"/>
-      <w:r>
-        <w:t>git</w:t>
-      </w:r>
-      <w:proofErr w:type="spellEnd"/>
-      <w:r>
-        <w:t xml:space="preserve"> </w:t>
-      </w:r>
-      <w:proofErr w:type="spellStart"/>
-      <w:r>
-        <w:t>pull</w:t>
-      </w:r>
-      <w:proofErr w:type="spellEnd"/>
-    </w:p>
-    <w:p/>
-    <w:p>
-      <w:r>
-        <w:t xml:space="preserve">Después revisaría los cambios, resolvería cualquier conflicto, crearía el </w:t>
-      </w:r>
-      <w:proofErr w:type="spellStart"/>
-      <w:r>
-        <w:t>commit</w:t>
-      </w:r>
-      <w:proofErr w:type="spellEnd"/>
-      <w:r>
-        <w:t xml:space="preserve"> correspondiente si fuera necesario y ejecutaría </w:t>
-      </w:r>
-      <w:proofErr w:type="spellStart"/>
-      <w:r>
-        <w:t>git</w:t>
-      </w:r>
-      <w:proofErr w:type="spellEnd"/>
-      <w:r>
-        <w:t xml:space="preserve"> </w:t>
-      </w:r>
-      <w:proofErr w:type="spellStart"/>
-      <w:r>
-        <w:t>push</w:t>
-      </w:r>
-      <w:proofErr w:type="spellEnd"/>
-      <w:r>
-        <w:t>.</w:t>
-      </w:r>
-    </w:p>
-    <w:p/>
-    <w:p>
-      <w:r>
-        <w:t xml:space="preserve">12. Tipos de </w:t>
-      </w:r>
-      <w:proofErr w:type="spellStart"/>
-      <w:r>
-        <w:t>Conventional</w:t>
-      </w:r>
-      <w:proofErr w:type="spellEnd"/>
-      <w:r>
-        <w:t xml:space="preserve"> </w:t>
-      </w:r>
-      <w:proofErr w:type="spellStart"/>
-      <w:r>
-        <w:t>Commits</w:t>
-      </w:r>
-      <w:proofErr w:type="spellEnd"/>
-    </w:p>
-    <w:p/>
-    <w:p>
-      <w:r>
-        <w:t xml:space="preserve">Para añadir un índice de rendimiento a una tabla utilizaría </w:t>
-      </w:r>
-      <w:proofErr w:type="spellStart"/>
-      <w:r>
-        <w:t>perf</w:t>
-      </w:r>
-      <w:proofErr w:type="spellEnd"/>
-      <w:r>
-        <w:t>, porque es una mejora de rendimiento:</w:t>
-      </w:r>
-    </w:p>
-    <w:p/>
-    <w:p>
-      <w:proofErr w:type="spellStart"/>
-      <w:r>
-        <w:t>perf</w:t>
-      </w:r>
-      <w:proofErr w:type="spellEnd"/>
-      <w:r>
-        <w:t>(</w:t>
-      </w:r>
-      <w:proofErr w:type="spellStart"/>
-      <w:r>
-        <w:t>db</w:t>
-      </w:r>
-      <w:proofErr w:type="spellEnd"/>
-      <w:r>
-        <w:t xml:space="preserve">): </w:t>
-      </w:r>
-      <w:proofErr w:type="spellStart"/>
-      <w:r>
-        <w:t>add</w:t>
-      </w:r>
-      <w:proofErr w:type="spellEnd"/>
-      <w:r>
-        <w:t xml:space="preserve"> </w:t>
-      </w:r>
-      <w:proofErr w:type="spellStart"/>
-      <w:r>
-        <w:t>customer</w:t>
-      </w:r>
-      <w:proofErr w:type="spellEnd"/>
-      <w:r>
-        <w:t xml:space="preserve"> </w:t>
-      </w:r>
-      <w:proofErr w:type="spellStart"/>
-      <w:r>
-        <w:t>lookup</w:t>
-      </w:r>
-      <w:proofErr w:type="spellEnd"/>
-      <w:r>
-        <w:t xml:space="preserve"> </w:t>
-      </w:r>
-      <w:proofErr w:type="spellStart"/>
-      <w:r>
-        <w:t>index</w:t>
-      </w:r>
-      <w:proofErr w:type="spellEnd"/>
-    </w:p>
-    <w:p/>
-    <w:p>
-      <w:r>
-        <w:t xml:space="preserve">Para corregir una restricción mal definida utilizaría </w:t>
-      </w:r>
-      <w:proofErr w:type="spellStart"/>
-      <w:r>
-        <w:t>fix</w:t>
-      </w:r>
-      <w:proofErr w:type="spellEnd"/>
-      <w:r>
-        <w:t>, porque estoy corrigiendo un error:</w:t>
-      </w:r>
-    </w:p>
-    <w:p/>
-    <w:p>
-      <w:proofErr w:type="spellStart"/>
-      <w:r>
-        <w:t>fix</w:t>
-      </w:r>
-      <w:proofErr w:type="spellEnd"/>
-      <w:r>
-        <w:t>(</w:t>
-      </w:r>
-      <w:proofErr w:type="spellStart"/>
-      <w:r>
-        <w:t>db</w:t>
-      </w:r>
-      <w:proofErr w:type="spellEnd"/>
-      <w:r>
-        <w:t xml:space="preserve">): </w:t>
-      </w:r>
-      <w:proofErr w:type="spellStart"/>
-      <w:r>
-        <w:t>correct</w:t>
-      </w:r>
-      <w:proofErr w:type="spellEnd"/>
-      <w:r>
-        <w:t xml:space="preserve"> </w:t>
-      </w:r>
-      <w:proofErr w:type="spellStart"/>
-      <w:r>
-        <w:t>invalid</w:t>
-      </w:r>
-      <w:proofErr w:type="spellEnd"/>
-      <w:r>
-        <w:t xml:space="preserve"> table </w:t>
-      </w:r>
-      <w:proofErr w:type="spellStart"/>
-      <w:r>
-        <w:t>constraint</w:t>
-      </w:r>
-      <w:proofErr w:type="spellEnd"/>
-    </w:p>
-    <w:p/>
-    <w:p>
-      <w:r>
-        <w:t xml:space="preserve">Para actualizar el README utilizaría </w:t>
-      </w:r>
-      <w:proofErr w:type="spellStart"/>
-      <w:r>
-        <w:t>docs</w:t>
-      </w:r>
-      <w:proofErr w:type="spellEnd"/>
-      <w:r>
-        <w:t>, porque el cambio afecta únicamente a la documentación:</w:t>
-      </w:r>
-    </w:p>
-    <w:p/>
-    <w:p>
-      <w:proofErr w:type="spellStart"/>
-      <w:r>
-        <w:t>docs</w:t>
-      </w:r>
-      <w:proofErr w:type="spellEnd"/>
-      <w:r>
-        <w:t xml:space="preserve">: </w:t>
-      </w:r>
-      <w:proofErr w:type="spellStart"/>
-      <w:r>
-        <w:t>update</w:t>
-      </w:r>
-      <w:proofErr w:type="spellEnd"/>
-      <w:r>
-        <w:t xml:space="preserve"> README</w:t>
-      </w:r>
-    </w:p>
-    <w:p/>
-    <w:p>
-      <w:r>
-        <w:t>LECCIONES APRENDIDAS</w:t>
-      </w:r>
-    </w:p>
-    <w:p/>
-    <w:p>
-      <w:r>
-        <w:t>1. Flujo de trabajo de Git</w:t>
-      </w:r>
-    </w:p>
-    <w:p/>
-    <w:p>
-      <w:r>
-        <w:t xml:space="preserve">He aprendido que un cambio pasa por varias zonas: Working </w:t>
-      </w:r>
-      <w:proofErr w:type="spellStart"/>
-      <w:r>
-        <w:t>Directory</w:t>
-      </w:r>
-      <w:proofErr w:type="spellEnd"/>
-      <w:r>
-        <w:t xml:space="preserve">, </w:t>
-      </w:r>
-      <w:proofErr w:type="spellStart"/>
-      <w:r>
-        <w:t>Staging</w:t>
-      </w:r>
-      <w:proofErr w:type="spellEnd"/>
-      <w:r>
-        <w:t xml:space="preserve"> </w:t>
-      </w:r>
-      <w:proofErr w:type="spellStart"/>
-      <w:r>
-        <w:t>Area</w:t>
-      </w:r>
-      <w:proofErr w:type="spellEnd"/>
-      <w:r>
-        <w:t xml:space="preserve">, Local </w:t>
-      </w:r>
-      <w:proofErr w:type="spellStart"/>
-      <w:r>
-        <w:t>Repository</w:t>
-      </w:r>
-      <w:proofErr w:type="spellEnd"/>
-      <w:r>
-        <w:t xml:space="preserve"> y Remote </w:t>
-      </w:r>
-      <w:proofErr w:type="spellStart"/>
-      <w:r>
-        <w:t>Repository</w:t>
-      </w:r>
-      <w:proofErr w:type="spellEnd"/>
-      <w:r>
-        <w:t xml:space="preserve">. El flujo habitual es editar un archivo, revisar </w:t>
-      </w:r>
-      <w:proofErr w:type="spellStart"/>
-      <w:r>
-        <w:t>git</w:t>
-      </w:r>
-      <w:proofErr w:type="spellEnd"/>
-      <w:r>
-        <w:t xml:space="preserve"> status, añadirlo con </w:t>
-      </w:r>
-      <w:proofErr w:type="spellStart"/>
-      <w:r>
-        <w:t>git</w:t>
-      </w:r>
-      <w:proofErr w:type="spellEnd"/>
-      <w:r>
-        <w:t xml:space="preserve"> </w:t>
-      </w:r>
-      <w:proofErr w:type="spellStart"/>
-      <w:r>
-        <w:t>add</w:t>
-      </w:r>
-      <w:proofErr w:type="spellEnd"/>
-      <w:r>
-        <w:t xml:space="preserve">, revisar </w:t>
-      </w:r>
-      <w:proofErr w:type="spellStart"/>
-      <w:r>
-        <w:t>git</w:t>
-      </w:r>
-      <w:proofErr w:type="spellEnd"/>
-      <w:r>
-        <w:t xml:space="preserve"> </w:t>
-      </w:r>
-      <w:proofErr w:type="spellStart"/>
-      <w:r>
-        <w:t>diff</w:t>
-      </w:r>
-      <w:proofErr w:type="spellEnd"/>
-      <w:r>
-        <w:t xml:space="preserve"> --</w:t>
-      </w:r>
-      <w:proofErr w:type="spellStart"/>
-      <w:r>
-        <w:t>staged</w:t>
-      </w:r>
-      <w:proofErr w:type="spellEnd"/>
-      <w:r>
-        <w:t xml:space="preserve">, crear un </w:t>
-      </w:r>
-      <w:proofErr w:type="spellStart"/>
-      <w:r>
-        <w:t>commit</w:t>
-      </w:r>
-      <w:proofErr w:type="spellEnd"/>
-      <w:r>
-        <w:t xml:space="preserve"> y finalmente hacer </w:t>
-      </w:r>
-      <w:proofErr w:type="spellStart"/>
-      <w:r>
-        <w:t>git</w:t>
-      </w:r>
-      <w:proofErr w:type="spellEnd"/>
-      <w:r>
-        <w:t xml:space="preserve"> </w:t>
-      </w:r>
-      <w:proofErr w:type="spellStart"/>
-      <w:r>
-        <w:t>push</w:t>
-      </w:r>
-      <w:proofErr w:type="spellEnd"/>
-      <w:r>
-        <w:t>.</w:t>
-      </w:r>
-    </w:p>
-    <w:p/>
-    <w:p>
-      <w:r>
         <w:t xml:space="preserve">2. Importancia de </w:t>
       </w:r>
       <w:proofErr w:type="spellStart"/>
@@ -1281,18 +1376,31 @@
       </w:r>
       <w:proofErr w:type="spellEnd"/>
       <w:r>
-        <w:t xml:space="preserve"> status</w:t>
-      </w:r>
-    </w:p>
-    <w:p/>
-    <w:p>
-      <w:proofErr w:type="spellStart"/>
-      <w:r>
-        <w:t>git</w:t>
-      </w:r>
-      <w:proofErr w:type="spellEnd"/>
-      <w:r>
-        <w:t xml:space="preserve"> status es una de las herramientas más importantes para saber en qué situación se encuentra el repositorio. Permite ver la rama actual, los archivos sin seguimiento, los cambios preparados y los cambios todavía no preparados.</w:t>
+        <w:t xml:space="preserve"> </w:t>
+      </w:r>
+      <w:proofErr w:type="gramStart"/>
+      <w:r>
+        <w:t>status</w:t>
+      </w:r>
+      <w:proofErr w:type="gramEnd"/>
+    </w:p>
+    <w:p/>
+    <w:p>
+      <w:proofErr w:type="spellStart"/>
+      <w:r>
+        <w:t>git</w:t>
+      </w:r>
+      <w:proofErr w:type="spellEnd"/>
+      <w:r>
+        <w:t xml:space="preserve"> </w:t>
+      </w:r>
+      <w:proofErr w:type="gramStart"/>
+      <w:r>
+        <w:t>status</w:t>
+      </w:r>
+      <w:proofErr w:type="gramEnd"/>
+      <w:r>
+        <w:t xml:space="preserve"> es una de las herramientas más importantes para saber en qué situación se encuentra el repositorio. Permite ver la rama actual, los archivos sin seguimiento, los cambios preparados y los cambios todavía no preparados.</w:t>
       </w:r>
     </w:p>
     <w:p/>
@@ -1722,13 +1830,18 @@
       </w:r>
       <w:proofErr w:type="spellEnd"/>
       <w:r>
-        <w:t xml:space="preserve"> ayuda a separar el código, los scripts y la documentación técnica. Los archivos .</w:t>
+        <w:t xml:space="preserve"> ayuda a separar el código, los scripts y la documentación técnica. Los </w:t>
+      </w:r>
+      <w:proofErr w:type="gramStart"/>
+      <w:r>
+        <w:t>archivos .</w:t>
       </w:r>
       <w:proofErr w:type="spellStart"/>
       <w:r>
         <w:t>gitkeep</w:t>
       </w:r>
       <w:proofErr w:type="spellEnd"/>
+      <w:proofErr w:type="gramEnd"/>
       <w:r>
         <w:t xml:space="preserve"> permiten conservar las carpetas que todavía están vacías.</w:t>
       </w:r>
@@ -1758,7 +1871,15 @@
       </w:r>
       <w:proofErr w:type="spellEnd"/>
       <w:r>
-        <w:t xml:space="preserve"> status y </w:t>
+        <w:t xml:space="preserve"> </w:t>
+      </w:r>
+      <w:proofErr w:type="gramStart"/>
+      <w:r>
+        <w:t>status</w:t>
+      </w:r>
+      <w:proofErr w:type="gramEnd"/>
+      <w:r>
+        <w:t xml:space="preserve"> y </w:t>
       </w:r>
       <w:proofErr w:type="spellStart"/>
       <w:r>
@@ -1844,8 +1965,13 @@
       </w:r>
       <w:proofErr w:type="spellEnd"/>
       <w:r>
-        <w:t xml:space="preserve"> status</w:t>
-      </w:r>
+        <w:t xml:space="preserve"> </w:t>
+      </w:r>
+      <w:proofErr w:type="gramStart"/>
+      <w:r>
+        <w:t>status</w:t>
+      </w:r>
+      <w:proofErr w:type="gramEnd"/>
     </w:p>
     <w:p>
       <w:r>
@@ -2097,6 +2223,13 @@
         <w:t>, trabajar con ramas, resolver conflictos y conectar el repositorio local con GitHub. También he comprobado la importancia de revisar el estado y el contenido antes de confirmar o subir cualquier cambio.</w:t>
       </w:r>
     </w:p>
+    <w:p/>
+    <w:p>
+      <w:r>
+        <w:t>Capturas:</w:t>
+      </w:r>
+    </w:p>
+    <w:p/>
     <w:sectPr>
       <w:pgSz w:w="11906" w:h="16838"/>
       <w:pgMar w:top="1417" w:right="1701" w:bottom="1417" w:left="1701" w:header="708" w:footer="708" w:gutter="0"/>

</xml_diff>